<commit_message>
Modification pour tableau dynamique et fichier éxecution
</commit_message>
<xml_diff>
--- a/Execution/Execution du mini projet PYTHON _ BOUAMAR Bilel.docx
+++ b/Execution/Execution du mini projet PYTHON _ BOUAMAR Bilel.docx
@@ -132,7 +132,15 @@
           <w:sz w:val="50"/>
           <w:szCs w:val="50"/>
         </w:rPr>
-        <w:t>du mini projet réalisé en C</w:t>
+        <w:t xml:space="preserve">du mini projet réalisé en </w:t>
+      </w:r>
+      <w:r>
+        <w:rPr>
+          <w:rFonts w:ascii="Arial" w:hAnsi="Arial" w:cs="Arial"/>
+          <w:sz w:val="50"/>
+          <w:szCs w:val="50"/>
+        </w:rPr>
+        <w:t>PYTHON</w:t>
       </w:r>
     </w:p>
     <w:p>
@@ -929,16 +937,14 @@
     <w:p>
       <w:pPr>
         <w:pStyle w:val="Textbody"/>
-      </w:pPr>
-      <w:r>
-        <w:rPr>
-          <w:noProof/>
-        </w:rPr>
+        <w:jc w:val="center"/>
+      </w:pPr>
+      <w:r>
         <w:drawing>
-          <wp:inline distT="0" distB="0" distL="0" distR="0" wp14:anchorId="060A8BBC" wp14:editId="1F22681C">
-            <wp:extent cx="6391275" cy="3389096"/>
+          <wp:inline distT="0" distB="0" distL="0" distR="0" wp14:anchorId="78A01D02" wp14:editId="27D34FDB">
+            <wp:extent cx="4675909" cy="6132795"/>
             <wp:effectExtent l="0" t="0" r="0" b="1905"/>
-            <wp:docPr id="689341750" name="Image 1"/>
+            <wp:docPr id="1384315058" name="Image 1"/>
             <wp:cNvGraphicFramePr>
               <a:graphicFrameLocks xmlns:a="http://schemas.openxmlformats.org/drawingml/2006/main" noChangeAspect="1"/>
             </wp:cNvGraphicFramePr>
@@ -946,32 +952,23 @@
               <a:graphicData uri="http://schemas.openxmlformats.org/drawingml/2006/picture">
                 <pic:pic xmlns:pic="http://schemas.openxmlformats.org/drawingml/2006/picture">
                   <pic:nvPicPr>
-                    <pic:cNvPr id="689341750" name=""/>
+                    <pic:cNvPr id="1384315058" name=""/>
                     <pic:cNvPicPr/>
                   </pic:nvPicPr>
-                  <pic:blipFill rotWithShape="1">
+                  <pic:blipFill>
                     <a:blip r:embed="rId8"/>
-                    <a:srcRect t="1145"/>
                     <a:stretch>
                       <a:fillRect/>
                     </a:stretch>
                   </pic:blipFill>
-                  <pic:spPr bwMode="auto">
+                  <pic:spPr>
                     <a:xfrm>
                       <a:off x="0" y="0"/>
-                      <a:ext cx="6391275" cy="3389096"/>
+                      <a:ext cx="4691941" cy="6153822"/>
                     </a:xfrm>
                     <a:prstGeom prst="rect">
                       <a:avLst/>
                     </a:prstGeom>
-                    <a:ln>
-                      <a:noFill/>
-                    </a:ln>
-                    <a:extLst>
-                      <a:ext uri="{53640926-AAD7-44D8-BBD7-CCE9431645EC}">
-                        <a14:shadowObscured xmlns:a14="http://schemas.microsoft.com/office/drawing/2010/main"/>
-                      </a:ext>
-                    </a:extLst>
                   </pic:spPr>
                 </pic:pic>
               </a:graphicData>
@@ -981,101 +978,42 @@
       </w:r>
     </w:p>
     <w:p>
-      <w:pPr>
-        <w:pStyle w:val="Textbody"/>
-      </w:pPr>
-      <w:r>
-        <w:t>Ci-dessous les matrices L, U et y :</w:t>
+      <w:r>
+        <w:br w:type="page"/>
       </w:r>
     </w:p>
     <w:p>
       <w:pPr>
-        <w:pStyle w:val="Textbody"/>
-      </w:pPr>
-      <w:r>
-        <w:rPr>
-          <w:noProof/>
-        </w:rPr>
-        <w:drawing>
-          <wp:inline distT="0" distB="0" distL="0" distR="0" wp14:anchorId="73B9FA2E" wp14:editId="71A9A9A0">
-            <wp:extent cx="6286499" cy="2611622"/>
-            <wp:effectExtent l="0" t="0" r="635" b="0"/>
-            <wp:docPr id="527915189" name="Image 1"/>
-            <wp:cNvGraphicFramePr>
-              <a:graphicFrameLocks xmlns:a="http://schemas.openxmlformats.org/drawingml/2006/main" noChangeAspect="1"/>
-            </wp:cNvGraphicFramePr>
-            <a:graphic xmlns:a="http://schemas.openxmlformats.org/drawingml/2006/main">
-              <a:graphicData uri="http://schemas.openxmlformats.org/drawingml/2006/picture">
-                <pic:pic xmlns:pic="http://schemas.openxmlformats.org/drawingml/2006/picture">
-                  <pic:nvPicPr>
-                    <pic:cNvPr id="527915189" name=""/>
-                    <pic:cNvPicPr/>
-                  </pic:nvPicPr>
-                  <pic:blipFill rotWithShape="1">
-                    <a:blip r:embed="rId9"/>
-                    <a:srcRect t="2771"/>
-                    <a:stretch>
-                      <a:fillRect/>
-                    </a:stretch>
-                  </pic:blipFill>
-                  <pic:spPr bwMode="auto">
-                    <a:xfrm>
-                      <a:off x="0" y="0"/>
-                      <a:ext cx="6287377" cy="2611987"/>
-                    </a:xfrm>
-                    <a:prstGeom prst="rect">
-                      <a:avLst/>
-                    </a:prstGeom>
-                    <a:ln>
-                      <a:noFill/>
-                    </a:ln>
-                    <a:extLst>
-                      <a:ext uri="{53640926-AAD7-44D8-BBD7-CCE9431645EC}">
-                        <a14:shadowObscured xmlns:a14="http://schemas.microsoft.com/office/drawing/2010/main"/>
-                      </a:ext>
-                    </a:extLst>
-                  </pic:spPr>
-                </pic:pic>
-              </a:graphicData>
-            </a:graphic>
-          </wp:inline>
-        </w:drawing>
+        <w:pStyle w:val="Titre1"/>
+      </w:pPr>
+      <w:r>
+        <w:lastRenderedPageBreak/>
+        <w:t>Test #2 – Cas simple</w:t>
       </w:r>
     </w:p>
     <w:p>
       <w:r>
-        <w:br w:type="page"/>
+        <w:t>Ce test permet à ce que le programme se déroule sans défaut, c’est-à-dire qu’aucun pivot à 0, qu</w:t>
+      </w:r>
+      <w:r>
+        <w:t xml:space="preserve">’il permet une vrais </w:t>
+      </w:r>
+      <w:r>
+        <w:t xml:space="preserve">décomposition </w:t>
+      </w:r>
+      <w:r>
+        <w:t xml:space="preserve">en L et U et également </w:t>
+      </w:r>
+      <w:r>
+        <w:t>suffisamment simple pour effectuer les calculs à la main pour s’assurer du résultat.</w:t>
       </w:r>
     </w:p>
     <w:p>
       <w:pPr>
-        <w:pStyle w:val="Titre1"/>
-      </w:pPr>
-      <w:r>
-        <w:lastRenderedPageBreak/>
-        <w:t>Test #2 – Cas simple</w:t>
-      </w:r>
-    </w:p>
-    <w:p>
-      <w:r>
-        <w:t>Ce test permet à ce que le programme se déroule sans défaut, c’est-à-dire qu’aucun pivot à 0, qu</w:t>
-      </w:r>
-      <w:r>
-        <w:t xml:space="preserve">’il permet une vrais </w:t>
-      </w:r>
-      <w:r>
-        <w:t xml:space="preserve">décomposition </w:t>
-      </w:r>
-      <w:r>
-        <w:t xml:space="preserve">en L et U et également </w:t>
-      </w:r>
-      <w:r>
-        <w:t>suffisamment simple pour effectuer les calculs à la main pour s’assurer du résultat.</w:t>
-      </w:r>
-    </w:p>
-    <w:p>
-      <w:pPr>
         <w:pStyle w:val="Textbody"/>
+        <w:rPr>
+          <w:noProof/>
+        </w:rPr>
       </w:pPr>
       <w:r>
         <w:t xml:space="preserve">Pour ce test la matrice A et b sont les suivantes : </w:t>
@@ -1122,7 +1060,7 @@
                     <w:rPr>
                       <w:rFonts w:ascii="Cambria Math" w:hAnsi="Cambria Math"/>
                     </w:rPr>
-                    <m:t>1</m:t>
+                    <m:t>2</m:t>
                   </m:r>
                 </m:e>
                 <m:e>
@@ -1148,7 +1086,7 @@
                     <w:rPr>
                       <w:rFonts w:ascii="Cambria Math" w:hAnsi="Cambria Math"/>
                     </w:rPr>
-                    <m:t>2</m:t>
+                    <m:t>4</m:t>
                   </m:r>
                 </m:e>
                 <m:e>
@@ -1164,7 +1102,7 @@
                     <w:rPr>
                       <w:rFonts w:ascii="Cambria Math" w:hAnsi="Cambria Math"/>
                     </w:rPr>
-                    <m:t>1</m:t>
+                    <m:t>3</m:t>
                   </m:r>
                 </m:e>
               </m:mr>
@@ -1174,7 +1112,7 @@
                     <w:rPr>
                       <w:rFonts w:ascii="Cambria Math" w:hAnsi="Cambria Math"/>
                     </w:rPr>
-                    <m:t>1</m:t>
+                    <m:t>8</m:t>
                   </m:r>
                 </m:e>
                 <m:e>
@@ -1182,7 +1120,7 @@
                     <w:rPr>
                       <w:rFonts w:ascii="Cambria Math" w:hAnsi="Cambria Math"/>
                     </w:rPr>
-                    <m:t>2</m:t>
+                    <m:t>7</m:t>
                   </m:r>
                 </m:e>
                 <m:e>
@@ -1190,7 +1128,7 @@
                     <w:rPr>
                       <w:rFonts w:ascii="Cambria Math" w:hAnsi="Cambria Math"/>
                     </w:rPr>
-                    <m:t>3</m:t>
+                    <m:t>9</m:t>
                   </m:r>
                 </m:e>
               </m:mr>
@@ -1238,7 +1176,7 @@
                     <w:rPr>
                       <w:rFonts w:ascii="Cambria Math" w:hAnsi="Cambria Math"/>
                     </w:rPr>
-                    <m:t>6</m:t>
+                    <m:t>1</m:t>
                   </m:r>
                 </m:e>
               </m:mr>
@@ -1248,7 +1186,7 @@
                     <w:rPr>
                       <w:rFonts w:ascii="Cambria Math" w:hAnsi="Cambria Math"/>
                     </w:rPr>
-                    <m:t>10</m:t>
+                    <m:t>3</m:t>
                   </m:r>
                 </m:e>
               </m:mr>
@@ -1258,7 +1196,7 @@
                     <w:rPr>
                       <w:rFonts w:ascii="Cambria Math" w:hAnsi="Cambria Math"/>
                     </w:rPr>
-                    <m:t>14</m:t>
+                    <m:t>5</m:t>
                   </m:r>
                 </m:e>
               </m:mr>
@@ -1311,7 +1249,7 @@
                     <w:rPr>
                       <w:rFonts w:ascii="Cambria Math" w:hAnsi="Cambria Math"/>
                     </w:rPr>
-                    <m:t>1</m:t>
+                    <m:t>0</m:t>
                   </m:r>
                 </m:e>
               </m:mr>
@@ -1331,7 +1269,7 @@
                     <w:rPr>
                       <w:rFonts w:ascii="Cambria Math" w:hAnsi="Cambria Math"/>
                     </w:rPr>
-                    <m:t>3</m:t>
+                    <m:t>-1</m:t>
                   </m:r>
                 </m:e>
               </m:mr>
@@ -1340,11 +1278,23 @@
         </m:d>
       </m:oMath>
       <w:r>
+        <w:rPr>
+          <w:noProof/>
+        </w:rPr>
+        <w:t xml:space="preserve"> </w:t>
+      </w:r>
+    </w:p>
+    <w:p>
+      <w:pPr>
+        <w:pStyle w:val="Textbody"/>
+        <w:jc w:val="center"/>
+      </w:pPr>
+      <w:r>
         <w:drawing>
-          <wp:inline distT="0" distB="0" distL="0" distR="0" wp14:anchorId="2C2FF835" wp14:editId="1E1C0A51">
-            <wp:extent cx="6391275" cy="3369734"/>
-            <wp:effectExtent l="0" t="0" r="0" b="2540"/>
-            <wp:docPr id="630170894" name="Image 1"/>
+          <wp:inline distT="0" distB="0" distL="0" distR="0" wp14:anchorId="44AAD8C2" wp14:editId="2BDC4E27">
+            <wp:extent cx="4475503" cy="6294120"/>
+            <wp:effectExtent l="0" t="0" r="1270" b="0"/>
+            <wp:docPr id="643485973" name="Image 1"/>
             <wp:cNvGraphicFramePr>
               <a:graphicFrameLocks xmlns:a="http://schemas.openxmlformats.org/drawingml/2006/main" noChangeAspect="1"/>
             </wp:cNvGraphicFramePr>
@@ -1352,74 +1302,11 @@
               <a:graphicData uri="http://schemas.openxmlformats.org/drawingml/2006/picture">
                 <pic:pic xmlns:pic="http://schemas.openxmlformats.org/drawingml/2006/picture">
                   <pic:nvPicPr>
-                    <pic:cNvPr id="630170894" name=""/>
-                    <pic:cNvPicPr/>
-                  </pic:nvPicPr>
-                  <pic:blipFill rotWithShape="1">
-                    <a:blip r:embed="rId10"/>
-                    <a:srcRect t="1468" b="1144"/>
-                    <a:stretch>
-                      <a:fillRect/>
-                    </a:stretch>
-                  </pic:blipFill>
-                  <pic:spPr bwMode="auto">
-                    <a:xfrm>
-                      <a:off x="0" y="0"/>
-                      <a:ext cx="6391275" cy="3369734"/>
-                    </a:xfrm>
-                    <a:prstGeom prst="rect">
-                      <a:avLst/>
-                    </a:prstGeom>
-                    <a:ln>
-                      <a:noFill/>
-                    </a:ln>
-                    <a:extLst>
-                      <a:ext uri="{53640926-AAD7-44D8-BBD7-CCE9431645EC}">
-                        <a14:shadowObscured xmlns:a14="http://schemas.microsoft.com/office/drawing/2010/main"/>
-                      </a:ext>
-                    </a:extLst>
-                  </pic:spPr>
-                </pic:pic>
-              </a:graphicData>
-            </a:graphic>
-          </wp:inline>
-        </w:drawing>
-      </w:r>
-    </w:p>
-    <w:p>
-      <w:pPr>
-        <w:pStyle w:val="Textbody"/>
-      </w:pPr>
-      <w:r>
-        <w:t>Ci-dessous les matrices L, U et y :</w:t>
-      </w:r>
-    </w:p>
-    <w:p>
-      <w:pPr>
-        <w:rPr>
-          <w:rFonts w:ascii="Liberation Sans" w:eastAsia="Microsoft YaHei" w:hAnsi="Liberation Sans"/>
-          <w:sz w:val="28"/>
-          <w:szCs w:val="28"/>
-        </w:rPr>
-      </w:pPr>
-      <w:r>
-        <w:drawing>
-          <wp:inline distT="0" distB="0" distL="0" distR="0" wp14:anchorId="73D2AEB6" wp14:editId="1A09C739">
-            <wp:extent cx="5844872" cy="2524125"/>
-            <wp:effectExtent l="0" t="0" r="3810" b="0"/>
-            <wp:docPr id="1527374007" name="Image 1"/>
-            <wp:cNvGraphicFramePr>
-              <a:graphicFrameLocks xmlns:a="http://schemas.openxmlformats.org/drawingml/2006/main" noChangeAspect="1"/>
-            </wp:cNvGraphicFramePr>
-            <a:graphic xmlns:a="http://schemas.openxmlformats.org/drawingml/2006/main">
-              <a:graphicData uri="http://schemas.openxmlformats.org/drawingml/2006/picture">
-                <pic:pic xmlns:pic="http://schemas.openxmlformats.org/drawingml/2006/picture">
-                  <pic:nvPicPr>
-                    <pic:cNvPr id="1527374007" name=""/>
+                    <pic:cNvPr id="643485973" name=""/>
                     <pic:cNvPicPr/>
                   </pic:nvPicPr>
                   <pic:blipFill>
-                    <a:blip r:embed="rId11"/>
+                    <a:blip r:embed="rId9"/>
                     <a:stretch>
                       <a:fillRect/>
                     </a:stretch>
@@ -1427,7 +1314,7 @@
                   <pic:spPr>
                     <a:xfrm>
                       <a:off x="0" y="0"/>
-                      <a:ext cx="5888189" cy="2542832"/>
+                      <a:ext cx="4481911" cy="6303132"/>
                     </a:xfrm>
                     <a:prstGeom prst="rect">
                       <a:avLst/>
@@ -1449,7 +1336,19 @@
       </w:pPr>
       <w:r>
         <w:lastRenderedPageBreak/>
-        <w:t xml:space="preserve">Test#2 </w:t>
+        <w:t>Test</w:t>
+      </w:r>
+      <w:r>
+        <w:t xml:space="preserve"> </w:t>
+      </w:r>
+      <w:r>
+        <w:t>#</w:t>
+      </w:r>
+      <w:r>
+        <w:t>3</w:t>
+      </w:r>
+      <w:r>
+        <w:t xml:space="preserve"> </w:t>
       </w:r>
       <w:r>
         <w:t>–</w:t>
@@ -1701,29 +1600,31 @@
     </w:p>
     <w:p>
       <w:pPr>
-        <w:pStyle w:val="Standard"/>
-        <w:rPr>
-          <w:rFonts w:ascii="Arial" w:hAnsi="Arial" w:cs="Arial"/>
-        </w:rPr>
+        <w:pStyle w:val="Textbody"/>
       </w:pPr>
     </w:p>
     <w:p>
       <w:pPr>
+        <w:pStyle w:val="Textbody"/>
+      </w:pPr>
+    </w:p>
+    <w:p>
+      <w:pPr>
         <w:pStyle w:val="Standard"/>
-        <w:rPr>
-          <w:rFonts w:ascii="Arial" w:hAnsi="Arial" w:cs="Arial"/>
-        </w:rPr>
-      </w:pPr>
-      <w:r>
-        <w:rPr>
-          <w:rFonts w:ascii="Arial" w:hAnsi="Arial" w:cs="Arial"/>
-          <w:noProof/>
+        <w:jc w:val="center"/>
+        <w:rPr>
+          <w:rFonts w:ascii="Arial" w:hAnsi="Arial" w:cs="Arial"/>
+        </w:rPr>
+      </w:pPr>
+      <w:r>
+        <w:rPr>
+          <w:rFonts w:ascii="Arial" w:hAnsi="Arial" w:cs="Arial"/>
         </w:rPr>
         <w:drawing>
-          <wp:inline distT="0" distB="0" distL="0" distR="0" wp14:anchorId="0C2346C3" wp14:editId="07598EE2">
-            <wp:extent cx="6391275" cy="2979302"/>
+          <wp:inline distT="0" distB="0" distL="0" distR="0" wp14:anchorId="166006E3" wp14:editId="04FA6189">
+            <wp:extent cx="6236895" cy="3219450"/>
             <wp:effectExtent l="0" t="0" r="0" b="0"/>
-            <wp:docPr id="1247367252" name="Image 1"/>
+            <wp:docPr id="1269076534" name="Image 1"/>
             <wp:cNvGraphicFramePr>
               <a:graphicFrameLocks xmlns:a="http://schemas.openxmlformats.org/drawingml/2006/main" noChangeAspect="1"/>
             </wp:cNvGraphicFramePr>
@@ -1731,32 +1632,23 @@
               <a:graphicData uri="http://schemas.openxmlformats.org/drawingml/2006/picture">
                 <pic:pic xmlns:pic="http://schemas.openxmlformats.org/drawingml/2006/picture">
                   <pic:nvPicPr>
-                    <pic:cNvPr id="1247367252" name=""/>
+                    <pic:cNvPr id="1269076534" name=""/>
                     <pic:cNvPicPr/>
                   </pic:nvPicPr>
-                  <pic:blipFill rotWithShape="1">
-                    <a:blip r:embed="rId12"/>
-                    <a:srcRect t="3778"/>
+                  <pic:blipFill>
+                    <a:blip r:embed="rId10"/>
                     <a:stretch>
                       <a:fillRect/>
                     </a:stretch>
                   </pic:blipFill>
-                  <pic:spPr bwMode="auto">
+                  <pic:spPr>
                     <a:xfrm>
                       <a:off x="0" y="0"/>
-                      <a:ext cx="6391275" cy="2979302"/>
+                      <a:ext cx="6243273" cy="3222742"/>
                     </a:xfrm>
                     <a:prstGeom prst="rect">
                       <a:avLst/>
                     </a:prstGeom>
-                    <a:ln>
-                      <a:noFill/>
-                    </a:ln>
-                    <a:extLst>
-                      <a:ext uri="{53640926-AAD7-44D8-BBD7-CCE9431645EC}">
-                        <a14:shadowObscured xmlns:a14="http://schemas.microsoft.com/office/drawing/2010/main"/>
-                      </a:ext>
-                    </a:extLst>
                   </pic:spPr>
                 </pic:pic>
               </a:graphicData>
@@ -1784,7 +1676,19 @@
       </w:pPr>
       <w:r>
         <w:lastRenderedPageBreak/>
-        <w:t>Test#3 – Le 2</w:t>
+        <w:t>Test</w:t>
+      </w:r>
+      <w:r>
+        <w:t xml:space="preserve"> </w:t>
+      </w:r>
+      <w:r>
+        <w:t>#</w:t>
+      </w:r>
+      <w:r>
+        <w:t>4</w:t>
+      </w:r>
+      <w:r>
+        <w:t xml:space="preserve"> – Le 2</w:t>
       </w:r>
       <w:r>
         <w:rPr>
@@ -2042,16 +1946,14 @@
     <w:p>
       <w:pPr>
         <w:pStyle w:val="Textbody"/>
-      </w:pPr>
-      <w:r>
-        <w:rPr>
-          <w:noProof/>
-        </w:rPr>
+        <w:jc w:val="center"/>
+      </w:pPr>
+      <w:r>
         <w:drawing>
-          <wp:inline distT="0" distB="0" distL="0" distR="0" wp14:anchorId="36C01C8C" wp14:editId="43D99622">
-            <wp:extent cx="6391275" cy="2996270"/>
-            <wp:effectExtent l="0" t="0" r="0" b="0"/>
-            <wp:docPr id="863558526" name="Image 1"/>
+          <wp:inline distT="0" distB="0" distL="0" distR="0" wp14:anchorId="5588AF2F" wp14:editId="1564E36A">
+            <wp:extent cx="5921993" cy="2978727"/>
+            <wp:effectExtent l="0" t="0" r="3175" b="0"/>
+            <wp:docPr id="495562282" name="Image 1"/>
             <wp:cNvGraphicFramePr>
               <a:graphicFrameLocks xmlns:a="http://schemas.openxmlformats.org/drawingml/2006/main" noChangeAspect="1"/>
             </wp:cNvGraphicFramePr>
@@ -2059,32 +1961,23 @@
               <a:graphicData uri="http://schemas.openxmlformats.org/drawingml/2006/picture">
                 <pic:pic xmlns:pic="http://schemas.openxmlformats.org/drawingml/2006/picture">
                   <pic:nvPicPr>
-                    <pic:cNvPr id="863558526" name=""/>
+                    <pic:cNvPr id="495562282" name=""/>
                     <pic:cNvPicPr/>
                   </pic:nvPicPr>
-                  <pic:blipFill rotWithShape="1">
-                    <a:blip r:embed="rId13"/>
-                    <a:srcRect t="2085"/>
+                  <pic:blipFill>
+                    <a:blip r:embed="rId11"/>
                     <a:stretch>
                       <a:fillRect/>
                     </a:stretch>
                   </pic:blipFill>
-                  <pic:spPr bwMode="auto">
+                  <pic:spPr>
                     <a:xfrm>
                       <a:off x="0" y="0"/>
-                      <a:ext cx="6391275" cy="2996270"/>
+                      <a:ext cx="5932037" cy="2983779"/>
                     </a:xfrm>
                     <a:prstGeom prst="rect">
                       <a:avLst/>
                     </a:prstGeom>
-                    <a:ln>
-                      <a:noFill/>
-                    </a:ln>
-                    <a:extLst>
-                      <a:ext uri="{53640926-AAD7-44D8-BBD7-CCE9431645EC}">
-                        <a14:shadowObscured xmlns:a14="http://schemas.microsoft.com/office/drawing/2010/main"/>
-                      </a:ext>
-                    </a:extLst>
                   </pic:spPr>
                 </pic:pic>
               </a:graphicData>
@@ -2104,7 +1997,13 @@
       </w:pPr>
       <w:r>
         <w:lastRenderedPageBreak/>
-        <w:t>Test #4 – Le dernier pivot</w:t>
+        <w:t>Test #</w:t>
+      </w:r>
+      <w:r>
+        <w:t>5</w:t>
+      </w:r>
+      <w:r>
+        <w:t xml:space="preserve"> – Le dernier pivot</w:t>
       </w:r>
       <w:r>
         <w:t xml:space="preserve"> à 0</w:t>
@@ -2358,16 +2257,14 @@
     <w:p>
       <w:pPr>
         <w:pStyle w:val="Textbody"/>
-      </w:pPr>
-      <w:r>
-        <w:rPr>
-          <w:noProof/>
-        </w:rPr>
+        <w:jc w:val="center"/>
+      </w:pPr>
+      <w:r>
         <w:drawing>
-          <wp:inline distT="0" distB="0" distL="0" distR="0" wp14:anchorId="25A7BBB4" wp14:editId="0EFD8C43">
-            <wp:extent cx="6391275" cy="3038475"/>
-            <wp:effectExtent l="0" t="0" r="9525" b="9525"/>
-            <wp:docPr id="1690463532" name="Image 1"/>
+          <wp:inline distT="0" distB="0" distL="0" distR="0" wp14:anchorId="54753E5D" wp14:editId="0AB42376">
+            <wp:extent cx="6224976" cy="3238500"/>
+            <wp:effectExtent l="0" t="0" r="4445" b="0"/>
+            <wp:docPr id="416431900" name="Image 1"/>
             <wp:cNvGraphicFramePr>
               <a:graphicFrameLocks xmlns:a="http://schemas.openxmlformats.org/drawingml/2006/main" noChangeAspect="1"/>
             </wp:cNvGraphicFramePr>
@@ -2375,11 +2272,11 @@
               <a:graphicData uri="http://schemas.openxmlformats.org/drawingml/2006/picture">
                 <pic:pic xmlns:pic="http://schemas.openxmlformats.org/drawingml/2006/picture">
                   <pic:nvPicPr>
-                    <pic:cNvPr id="1690463532" name=""/>
+                    <pic:cNvPr id="416431900" name=""/>
                     <pic:cNvPicPr/>
                   </pic:nvPicPr>
                   <pic:blipFill>
-                    <a:blip r:embed="rId14"/>
+                    <a:blip r:embed="rId12"/>
                     <a:stretch>
                       <a:fillRect/>
                     </a:stretch>
@@ -2387,7 +2284,7 @@
                   <pic:spPr>
                     <a:xfrm>
                       <a:off x="0" y="0"/>
-                      <a:ext cx="6391275" cy="3038475"/>
+                      <a:ext cx="6235520" cy="3243986"/>
                     </a:xfrm>
                     <a:prstGeom prst="rect">
                       <a:avLst/>
@@ -2402,8 +2299,8 @@
     </w:p>
     <w:p/>
     <w:sectPr>
-      <w:headerReference w:type="default" r:id="rId15"/>
-      <w:footerReference w:type="default" r:id="rId16"/>
+      <w:headerReference w:type="default" r:id="rId13"/>
+      <w:footerReference w:type="default" r:id="rId14"/>
       <w:pgSz w:w="11906" w:h="16838"/>
       <w:pgMar w:top="1134" w:right="707" w:bottom="142" w:left="1134" w:header="720" w:footer="720" w:gutter="0"/>
       <w:cols w:space="720"/>
@@ -2593,7 +2490,13 @@
             <w:rPr>
               <w:rFonts w:ascii="Arial" w:hAnsi="Arial" w:cs="Arial"/>
             </w:rPr>
-            <w:t>Exécution du programme du mini projet réalisé en C</w:t>
+            <w:t xml:space="preserve">Exécution du programme du mini projet réalisé en </w:t>
+          </w:r>
+          <w:r>
+            <w:rPr>
+              <w:rFonts w:ascii="Arial" w:hAnsi="Arial" w:cs="Arial"/>
+            </w:rPr>
+            <w:t>PYTHON</w:t>
           </w:r>
         </w:p>
       </w:tc>
@@ -2674,7 +2577,13 @@
             <w:rPr>
               <w:rFonts w:ascii="Arial" w:hAnsi="Arial" w:cs="Arial"/>
             </w:rPr>
-            <w:t>25/05/2026</w:t>
+            <w:t>30</w:t>
+          </w:r>
+          <w:r>
+            <w:rPr>
+              <w:rFonts w:ascii="Arial" w:hAnsi="Arial" w:cs="Arial"/>
+            </w:rPr>
+            <w:t>/05/2026</w:t>
           </w:r>
         </w:p>
       </w:tc>

</xml_diff>